<commit_message>
docs: effort log entries through 21 Sep, and the totals they change
Week three gains five entries: D-08 caching and pacing on 19 Sep, then the
20 Sep sessions -- the evaluation reporting and D-09 to D-12, the D-13 wall-clock
bound and the label audit, and the evening through D-14 to D-16, B-29 and the
compiled report -- plus submission packaging on 21 Sep.

Hours are estimates from commit spans, marked '(est.)' and called out as
reconstructed in the details note, on the same footing as weeks two and three.
Stage 5 goes to 63.5, stage 6 to 8.5, stage 7 from 0 to 2.5 now the report is
built; the actuals sum to the 113.5 the declaration states.

The 18 Sep row still reads '(in progress)' and is left alone: whether its hours
are already inside the earlier stage totals cannot be established from the
record, and guessing would double-count.

Co-Authored-By: Claude Opus 5 <noreply@anthropic.com>
</commit_message>
<xml_diff>
--- a/workbooks/Effort_Log.docx
+++ b/workbooks/Effort_Log.docx
@@ -473,11 +473,8 @@
             <w:shd w:val="clear" w:fill="F4F4F7"/>
           </w:tcPr>
           <w:p>
-            <w:pPr>
-              <w:spacing w:before="50" w:after="50"/>
-            </w:pPr>
-            <w:r>
-              <w:t>Individual project. Free-tier tooling throughout. Companion session used for planning, drafting, review, and code scaffolding. Weeks two and three were reconstructed on 2026-09-18 from git history and the Stage 4 daily check-ins; no contemporaneous hours were recorded for those weeks, so their hours are estimates from commit spans and are marked '(est.)'.</w:t>
+            <w:r>
+              <w:t>Individual project. Free-tier tooling throughout. Companion session used for planning, drafting, review, and code scaffolding. Weeks two and three were reconstructed on 2026-09-18 from git history and the Stage 4 daily check-ins; no contemporaneous hours were recorded for those weeks, so their hours are estimates from commit spans and are marked '(est.)'; the 19-21 September entries were reconstructed the same way on 2026-09-21.</w:t>
             </w:r>
           </w:p>
         </w:tc>
@@ -1152,11 +1149,8 @@
             </w:tcBorders>
           </w:tcPr>
           <w:p>
-            <w:pPr>
-              <w:spacing w:before="50" w:after="50"/>
-            </w:pPr>
-            <w:r>
-              <w:t>48.5</w:t>
+            <w:r>
+              <w:t>63.5</w:t>
             </w:r>
           </w:p>
         </w:tc>
@@ -1171,11 +1165,8 @@
             </w:tcBorders>
           </w:tcPr>
           <w:p>
-            <w:pPr>
-              <w:spacing w:before="50" w:after="50"/>
-            </w:pPr>
-            <w:r>
-              <w:t>+8.5</w:t>
+            <w:r>
+              <w:t>+23.5</w:t>
             </w:r>
           </w:p>
         </w:tc>
@@ -1190,11 +1181,8 @@
             </w:tcBorders>
           </w:tcPr>
           <w:p>
-            <w:pPr>
-              <w:spacing w:before="50" w:after="50"/>
-            </w:pPr>
-            <w:r>
-              <w:t>Reconstructed from git history (see weeks two and three). The overrun is evaluation, not components: the harness, three 80-ticket runs, the retrieval and ground-truth evaluations, the prompt A/B and the judge calibration.</w:t>
+            <w:r>
+              <w:t>Reconstructed from git history (see weeks two and three). The overrun is evaluation, not components: the harness, three 80-ticket runs, the retrieval and ground-truth evaluations, the prompt A/B and the judge calibration. 19-20 Sep added caching and pacing (D-08), the wall-clock bound (D-13), concurrent guardrails (D-12), the retrieval, PII and routing corrections (D-09, D-10, D-11, D-14) and the B-29 service.</w:t>
             </w:r>
           </w:p>
         </w:tc>
@@ -1255,11 +1243,8 @@
             <w:shd w:val="clear" w:fill="F4F4F7"/>
           </w:tcPr>
           <w:p>
-            <w:pPr>
-              <w:spacing w:before="50" w:after="50"/>
-            </w:pPr>
-            <w:r>
-              <w:t>7</w:t>
+            <w:r>
+              <w:t>8.5</w:t>
             </w:r>
           </w:p>
         </w:tc>
@@ -1275,11 +1260,8 @@
             <w:shd w:val="clear" w:fill="F4F4F7"/>
           </w:tcPr>
           <w:p>
-            <w:pPr>
-              <w:spacing w:before="50" w:after="50"/>
-            </w:pPr>
-            <w:r>
-              <w:t>-3</w:t>
+            <w:r>
+              <w:t>-1.5</w:t>
             </w:r>
           </w:p>
         </w:tc>
@@ -1295,11 +1277,8 @@
             <w:shd w:val="clear" w:fill="F4F4F7"/>
           </w:tcPr>
           <w:p>
-            <w:pPr>
-              <w:spacing w:before="50" w:after="50"/>
-            </w:pPr>
-            <w:r>
-              <w:t>Fairness audit and its code, risk register, incident procedure and kill switch. Under estimate because the fairness numbers came from the harness rather than a separate exercise.</w:t>
+            <w:r>
+              <w:t>Fairness audit and its code, risk register, incident procedure and kill switch. Under estimate because the fairness numbers came from the harness rather than a separate exercise. The kill switch (D-15) and input-side injection detection (D-16) landed 20 Sep.</w:t>
             </w:r>
           </w:p>
         </w:tc>
@@ -1357,11 +1336,8 @@
             </w:tcBorders>
           </w:tcPr>
           <w:p>
-            <w:pPr>
-              <w:spacing w:before="50" w:after="50"/>
-            </w:pPr>
-            <w:r>
-              <w:t>0</w:t>
+            <w:r>
+              <w:t>2.5</w:t>
             </w:r>
           </w:p>
         </w:tc>
@@ -1376,11 +1352,8 @@
             </w:tcBorders>
           </w:tcPr>
           <w:p>
-            <w:pPr>
-              <w:spacing w:before="50" w:after="50"/>
-            </w:pPr>
-            <w:r>
-              <w:t>-12</w:t>
+            <w:r>
+              <w:t>-9.5</w:t>
             </w:r>
           </w:p>
         </w:tc>
@@ -1395,11 +1368,8 @@
             </w:tcBorders>
           </w:tcPr>
           <w:p>
-            <w:pPr>
-              <w:spacing w:before="50" w:after="50"/>
-            </w:pPr>
-            <w:r>
-              <w:t>Not started — B-25 and B-26 remain.</w:t>
+            <w:r>
+              <w:t>Report compiled 20 Sep and committed to submission/02_Report. B-26 video not started, which is most of the remaining estimate.</w:t>
             </w:r>
           </w:p>
         </w:tc>
@@ -7768,13 +7738,8 @@
             </w:tcBorders>
           </w:tcPr>
           <w:p>
-            <w:pPr>
-              <w:spacing w:before="50" w:after="50"/>
-            </w:pPr>
-            <w:r>
-              <w:rPr>
-                <w:sz w:val="15"/>
-              </w:rPr>
+            <w:r>
+              <w:t>2026-09-19</w:t>
             </w:r>
           </w:p>
         </w:tc>
@@ -7789,13 +7754,8 @@
             </w:tcBorders>
           </w:tcPr>
           <w:p>
-            <w:pPr>
-              <w:spacing w:before="50" w:after="50"/>
-            </w:pPr>
-            <w:r>
-              <w:rPr>
-                <w:sz w:val="15"/>
-              </w:rPr>
+            <w:r>
+              <w:t>D-08 caching and retry budget. src/model_cache.py keyed on model, system prompt, user prompt, seed and temperature, wired ahead of the client at all three call sites so a warmed cache replays a run with no provider access. MODEL_MAX_RETRIES 2 to 5. src/rate_limit.py paces only after a provider refuses on a rate limit, honours Retry-After and caps the interval so an unattended run still terminates (A9). D-08 revisit trigger corrected.</w:t>
             </w:r>
           </w:p>
         </w:tc>
@@ -7810,13 +7770,8 @@
             </w:tcBorders>
           </w:tcPr>
           <w:p>
-            <w:pPr>
-              <w:spacing w:before="50" w:after="50"/>
-            </w:pPr>
-            <w:r>
-              <w:rPr>
-                <w:sz w:val="15"/>
-              </w:rPr>
+            <w:r>
+              <w:t>5</w:t>
             </w:r>
           </w:p>
         </w:tc>
@@ -7831,13 +7786,8 @@
             </w:tcBorders>
           </w:tcPr>
           <w:p>
-            <w:pPr>
-              <w:spacing w:before="50" w:after="50"/>
-            </w:pPr>
-            <w:r>
-              <w:rPr>
-                <w:sz w:val="15"/>
-              </w:rPr>
+            <w:r>
+              <w:t>5.0 (est.)</w:t>
             </w:r>
           </w:p>
         </w:tc>
@@ -7852,13 +7802,8 @@
             </w:tcBorders>
           </w:tcPr>
           <w:p>
-            <w:pPr>
-              <w:spacing w:before="50" w:after="50"/>
-            </w:pPr>
-            <w:r>
-              <w:rPr>
-                <w:sz w:val="15"/>
-              </w:rPr>
+            <w:r>
+              <w:t>src/model_cache.py; src/rate_limit.py; tests/conftest.py cache isolation; docs/adr/D-08. 511 passed, 5 skipped; lint clean.</w:t>
             </w:r>
           </w:p>
         </w:tc>
@@ -7873,13 +7818,8 @@
             </w:tcBorders>
           </w:tcPr>
           <w:p>
-            <w:pPr>
-              <w:spacing w:before="50" w:after="50"/>
-            </w:pPr>
-            <w:r>
-              <w:rPr>
-                <w:sz w:val="15"/>
-              </w:rPr>
+            <w:r>
+              <w:t>None. Landing the cache exposed two test faults: a stubbed reply written into the real cache, and call-assertion tests failing against a warm entry. Poisoned entries deleted.</w:t>
             </w:r>
           </w:p>
         </w:tc>
@@ -7894,16 +7834,10 @@
               <w:bottom w:val="single" w:sz="6" w:color="D9D9E0"/>
               <w:right w:val="single" w:sz="6" w:color="D9D9E0"/>
             </w:tcBorders>
-            <w:shd w:val="clear" w:fill="F4F4F7"/>
-          </w:tcPr>
-          <w:p>
-            <w:pPr>
-              <w:spacing w:before="50" w:after="50"/>
-            </w:pPr>
-            <w:r>
-              <w:rPr>
-                <w:sz w:val="15"/>
-              </w:rPr>
+          </w:tcPr>
+          <w:p>
+            <w:r>
+              <w:t>2026-09-20</w:t>
             </w:r>
           </w:p>
         </w:tc>
@@ -7916,16 +7850,10 @@
               <w:bottom w:val="single" w:sz="6" w:color="D9D9E0"/>
               <w:right w:val="single" w:sz="6" w:color="D9D9E0"/>
             </w:tcBorders>
-            <w:shd w:val="clear" w:fill="F4F4F7"/>
-          </w:tcPr>
-          <w:p>
-            <w:pPr>
-              <w:spacing w:before="50" w:after="50"/>
-            </w:pPr>
-            <w:r>
-              <w:rPr>
-                <w:sz w:val="15"/>
-              </w:rPr>
+          </w:tcPr>
+          <w:p>
+            <w:r>
+              <w:t>Evaluation reporting: cache replays logged, Evaluation Framework results table generated from the run, wrong sends split from wrong holds, each failure's stage named and timed. D-09 retrieval searches subject + body; D-10 no answerability gate from retrieval signals; D-11 an LLM PII detection must be shaped like the value it names; D-12 guardrails run concurrently. D-06a records the Self-RAG critic as built.</w:t>
             </w:r>
           </w:p>
         </w:tc>
@@ -7938,16 +7866,10 @@
               <w:bottom w:val="single" w:sz="6" w:color="D9D9E0"/>
               <w:right w:val="single" w:sz="6" w:color="D9D9E0"/>
             </w:tcBorders>
-            <w:shd w:val="clear" w:fill="F4F4F7"/>
-          </w:tcPr>
-          <w:p>
-            <w:pPr>
-              <w:spacing w:before="50" w:after="50"/>
-            </w:pPr>
-            <w:r>
-              <w:rPr>
-                <w:sz w:val="15"/>
-              </w:rPr>
+          </w:tcPr>
+          <w:p>
+            <w:r>
+              <w:t>5</w:t>
             </w:r>
           </w:p>
         </w:tc>
@@ -7960,16 +7882,10 @@
               <w:bottom w:val="single" w:sz="6" w:color="D9D9E0"/>
               <w:right w:val="single" w:sz="6" w:color="D9D9E0"/>
             </w:tcBorders>
-            <w:shd w:val="clear" w:fill="F4F4F7"/>
-          </w:tcPr>
-          <w:p>
-            <w:pPr>
-              <w:spacing w:before="50" w:after="50"/>
-            </w:pPr>
-            <w:r>
-              <w:rPr>
-                <w:sz w:val="15"/>
-              </w:rPr>
+          </w:tcPr>
+          <w:p>
+            <w:r>
+              <w:t>4.0 (est.)</w:t>
             </w:r>
           </w:p>
         </w:tc>
@@ -7982,16 +7898,10 @@
               <w:bottom w:val="single" w:sz="6" w:color="D9D9E0"/>
               <w:right w:val="single" w:sz="6" w:color="D9D9E0"/>
             </w:tcBorders>
-            <w:shd w:val="clear" w:fill="F4F4F7"/>
-          </w:tcPr>
-          <w:p>
-            <w:pPr>
-              <w:spacing w:before="50" w:after="50"/>
-            </w:pPr>
-            <w:r>
-              <w:rPr>
-                <w:sz w:val="15"/>
-              </w:rPr>
+          </w:tcPr>
+          <w:p>
+            <w:r>
+              <w:t>80-ticket run on local Ollama models ($0); OpenAI + Gemini rerun at 562f943 with cache off; concurrent-guardrail run 3.3x faster on the guardrail stage; docs/adr D-06a, D-09, D-10, D-11, D-12.</w:t>
             </w:r>
           </w:p>
         </w:tc>
@@ -8004,16 +7914,10 @@
               <w:bottom w:val="single" w:sz="6" w:color="D9D9E0"/>
               <w:right w:val="single" w:sz="6" w:color="D9D9E0"/>
             </w:tcBorders>
-            <w:shd w:val="clear" w:fill="F4F4F7"/>
-          </w:tcPr>
-          <w:p>
-            <w:pPr>
-              <w:spacing w:before="50" w:after="50"/>
-            </w:pPr>
-            <w:r>
-              <w:rPr>
-                <w:sz w:val="15"/>
-              </w:rPr>
+          </w:tcPr>
+          <w:p>
+            <w:r>
+              <w:t>None.</w:t>
             </w:r>
           </w:p>
         </w:tc>
@@ -8030,13 +7934,8 @@
             </w:tcBorders>
           </w:tcPr>
           <w:p>
-            <w:pPr>
-              <w:spacing w:before="50" w:after="50"/>
-            </w:pPr>
-            <w:r>
-              <w:rPr>
-                <w:sz w:val="15"/>
-              </w:rPr>
+            <w:r>
+              <w:t>2026-09-20</w:t>
             </w:r>
           </w:p>
         </w:tc>
@@ -8051,13 +7950,8 @@
             </w:tcBorders>
           </w:tcPr>
           <w:p>
-            <w:pPr>
-              <w:spacing w:before="50" w:after="50"/>
-            </w:pPr>
-            <w:r>
-              <w:rPr>
-                <w:sz w:val="15"/>
-              </w:rPr>
+            <w:r>
+              <w:t>D-13 wall-clock deadline on every provider call, found by a free-tier run that hung. Free-tier llama + nemotron runs recorded either side of the fix. Dataset label audit, with contested labels now reported alongside every run. PR-GUARDRAIL-RELEVANCE-01 to v1.1: no graded-set ticket id in the model-facing text.</w:t>
             </w:r>
           </w:p>
         </w:tc>
@@ -8072,13 +7966,8 @@
             </w:tcBorders>
           </w:tcPr>
           <w:p>
-            <w:pPr>
-              <w:spacing w:before="50" w:after="50"/>
-            </w:pPr>
-            <w:r>
-              <w:rPr>
-                <w:sz w:val="15"/>
-              </w:rPr>
+            <w:r>
+              <w:t>5</w:t>
             </w:r>
           </w:p>
         </w:tc>
@@ -8093,13 +7982,8 @@
             </w:tcBorders>
           </w:tcPr>
           <w:p>
-            <w:pPr>
-              <w:spacing w:before="50" w:after="50"/>
-            </w:pPr>
-            <w:r>
-              <w:rPr>
-                <w:sz w:val="15"/>
-              </w:rPr>
+            <w:r>
+              <w:t>3.0 (est.)</w:t>
             </w:r>
           </w:p>
         </w:tc>
@@ -8114,13 +7998,8 @@
             </w:tcBorders>
           </w:tcPr>
           <w:p>
-            <w:pPr>
-              <w:spacing w:before="50" w:after="50"/>
-            </w:pPr>
-            <w:r>
-              <w:rPr>
-                <w:sz w:val="15"/>
-              </w:rPr>
+            <w:r>
+              <w:t>Deadline bound at every call site; evaluation/results free-tier runs before and after; label audit and contested-label reporting; prompts/build/PR-GUARDRAIL-RELEVANCE-01.md v1.1.</w:t>
             </w:r>
           </w:p>
         </w:tc>
@@ -8135,13 +8014,8 @@
             </w:tcBorders>
           </w:tcPr>
           <w:p>
-            <w:pPr>
-              <w:spacing w:before="50" w:after="50"/>
-            </w:pPr>
-            <w:r>
-              <w:rPr>
-                <w:sz w:val="15"/>
-              </w:rPr>
+            <w:r>
+              <w:t>A free-tier run hung until D-13 bounded the call. That hang is what found the defect.</w:t>
             </w:r>
           </w:p>
         </w:tc>
@@ -8156,16 +8030,10 @@
               <w:bottom w:val="single" w:sz="6" w:color="D9D9E0"/>
               <w:right w:val="single" w:sz="6" w:color="D9D9E0"/>
             </w:tcBorders>
-            <w:shd w:val="clear" w:fill="F4F4F7"/>
-          </w:tcPr>
-          <w:p>
-            <w:pPr>
-              <w:spacing w:before="50" w:after="50"/>
-            </w:pPr>
-            <w:r>
-              <w:rPr>
-                <w:sz w:val="15"/>
-              </w:rPr>
+          </w:tcPr>
+          <w:p>
+            <w:r>
+              <w:t>2026-09-20</w:t>
             </w:r>
           </w:p>
         </w:tc>
@@ -8178,16 +8046,10 @@
               <w:bottom w:val="single" w:sz="6" w:color="D9D9E0"/>
               <w:right w:val="single" w:sz="6" w:color="D9D9E0"/>
             </w:tcBorders>
-            <w:shd w:val="clear" w:fill="F4F4F7"/>
-          </w:tcPr>
-          <w:p>
-            <w:pPr>
-              <w:spacing w:before="50" w:after="50"/>
-            </w:pPr>
-            <w:r>
-              <w:rPr>
-                <w:sz w:val="15"/>
-              </w:rPr>
+          </w:tcPr>
+          <w:p>
+            <w:r>
+              <w:t>D-14 a confidence-floor failure escalates and only a draft-reading check blocks. B-29 FastAPI service over the same pipeline the harness runs. FR-11 escalation bundle delivered rather than reported. D-15 kill switch, D-16 input-side injection detection, guardrail performance. architecture.md audited against src/ and README brought to submission state. Four demo tickets. Evaluation Framework results table filled from two live 10-ticket runs. Branch merged to main. Capstone report compiled.</w:t>
             </w:r>
           </w:p>
         </w:tc>
@@ -8200,16 +8062,10 @@
               <w:bottom w:val="single" w:sz="6" w:color="D9D9E0"/>
               <w:right w:val="single" w:sz="6" w:color="D9D9E0"/>
             </w:tcBorders>
-            <w:shd w:val="clear" w:fill="F4F4F7"/>
-          </w:tcPr>
-          <w:p>
-            <w:pPr>
-              <w:spacing w:before="50" w:after="50"/>
-            </w:pPr>
-            <w:r>
-              <w:rPr>
-                <w:sz w:val="15"/>
-              </w:rPr>
+          </w:tcPr>
+          <w:p>
+            <w:r>
+              <w:t>5+6+7</w:t>
             </w:r>
           </w:p>
         </w:tc>
@@ -8222,16 +8078,10 @@
               <w:bottom w:val="single" w:sz="6" w:color="D9D9E0"/>
               <w:right w:val="single" w:sz="6" w:color="D9D9E0"/>
             </w:tcBorders>
-            <w:shd w:val="clear" w:fill="F4F4F7"/>
-          </w:tcPr>
-          <w:p>
-            <w:pPr>
-              <w:spacing w:before="50" w:after="50"/>
-            </w:pPr>
-            <w:r>
-              <w:rPr>
-                <w:sz w:val="15"/>
-              </w:rPr>
+          </w:tcPr>
+          <w:p>
+            <w:r>
+              <w:t>6.5 (est.)</w:t>
             </w:r>
           </w:p>
         </w:tc>
@@ -8244,16 +8094,10 @@
               <w:bottom w:val="single" w:sz="6" w:color="D9D9E0"/>
               <w:right w:val="single" w:sz="6" w:color="D9D9E0"/>
             </w:tcBorders>
-            <w:shd w:val="clear" w:fill="F4F4F7"/>
-          </w:tcPr>
-          <w:p>
-            <w:pPr>
-              <w:spacing w:before="50" w:after="50"/>
-            </w:pPr>
-            <w:r>
-              <w:rPr>
-                <w:sz w:val="15"/>
-              </w:rPr>
+          </w:tcPr>
+          <w:p>
+            <w:r>
+              <w:t>src/api.py (B-29); docs/adr D-14, D-15, D-16; 10-ticket local run of record, the D-14 check and the paid run; docs/Evaluation_Framework.docx results table; submission/02_Report/AlokKulkarni_Capstone_Report.pdf (23:27).</w:t>
             </w:r>
           </w:p>
         </w:tc>
@@ -8266,16 +8110,10 @@
               <w:bottom w:val="single" w:sz="6" w:color="D9D9E0"/>
               <w:right w:val="single" w:sz="6" w:color="D9D9E0"/>
             </w:tcBorders>
-            <w:shd w:val="clear" w:fill="F4F4F7"/>
-          </w:tcPr>
-          <w:p>
-            <w:pPr>
-              <w:spacing w:before="50" w:after="50"/>
-            </w:pPr>
-            <w:r>
-              <w:rPr>
-                <w:sz w:val="15"/>
-              </w:rPr>
+          </w:tcPr>
+          <w:p>
+            <w:r>
+              <w:t>The paid 10-ticket run lost its judge.</w:t>
             </w:r>
           </w:p>
         </w:tc>
@@ -8292,13 +8130,8 @@
             </w:tcBorders>
           </w:tcPr>
           <w:p>
-            <w:pPr>
-              <w:spacing w:before="50" w:after="50"/>
-            </w:pPr>
-            <w:r>
-              <w:rPr>
-                <w:sz w:val="15"/>
-              </w:rPr>
+            <w:r>
+              <w:t>2026-09-21</w:t>
             </w:r>
           </w:p>
         </w:tc>
@@ -8313,13 +8146,8 @@
             </w:tcBorders>
           </w:tcPr>
           <w:p>
-            <w:pPr>
-              <w:spacing w:before="50" w:after="50"/>
-            </w:pPr>
-            <w:r>
-              <w:rPr>
-                <w:sz w:val="15"/>
-              </w:rPr>
+            <w:r>
+              <w:t>Submission packaging: the 20 Sep evidence pair and the compiled report committed and pushed to main. The one-shot Stage 3 fill scripts removed from the working tree and from history, since neither can be re-run against the filled workbook. Effort log brought up to date.</w:t>
             </w:r>
           </w:p>
         </w:tc>
@@ -8334,13 +8162,8 @@
             </w:tcBorders>
           </w:tcPr>
           <w:p>
-            <w:pPr>
-              <w:spacing w:before="50" w:after="50"/>
-            </w:pPr>
-            <w:r>
-              <w:rPr>
-                <w:sz w:val="15"/>
-              </w:rPr>
+            <w:r>
+              <w:t>7</w:t>
             </w:r>
           </w:p>
         </w:tc>
@@ -8355,13 +8178,8 @@
             </w:tcBorders>
           </w:tcPr>
           <w:p>
-            <w:pPr>
-              <w:spacing w:before="50" w:after="50"/>
-            </w:pPr>
-            <w:r>
-              <w:rPr>
-                <w:sz w:val="15"/>
-              </w:rPr>
+            <w:r>
+              <w:t>0.5 (est.)</w:t>
             </w:r>
           </w:p>
         </w:tc>
@@ -8376,13 +8194,8 @@
             </w:tcBorders>
           </w:tcPr>
           <w:p>
-            <w:pPr>
-              <w:spacing w:before="50" w:after="50"/>
-            </w:pPr>
-            <w:r>
-              <w:rPr>
-                <w:sz w:val="15"/>
-              </w:rPr>
+            <w:r>
+              <w:t>Commit 8dc11dd on origin/main; workbooks/Effort_Log.docx week-three entries through 21 Sep.</w:t>
             </w:r>
           </w:p>
         </w:tc>
@@ -8397,799 +8210,8 @@
             </w:tcBorders>
           </w:tcPr>
           <w:p>
-            <w:pPr>
-              <w:spacing w:before="50" w:after="50"/>
-            </w:pPr>
-            <w:r>
-              <w:rPr>
-                <w:sz w:val="15"/>
-              </w:rPr>
-            </w:r>
-          </w:p>
-        </w:tc>
-      </w:tr>
-      <w:tr>
-        <w:tc>
-          <w:tcPr>
-            <w:tcW w:type="dxa" w:w="1152"/>
-            <w:tcBorders>
-              <w:top w:val="single" w:sz="6" w:color="D9D9E0"/>
-              <w:left w:val="single" w:sz="6" w:color="D9D9E0"/>
-              <w:bottom w:val="single" w:sz="6" w:color="D9D9E0"/>
-              <w:right w:val="single" w:sz="6" w:color="D9D9E0"/>
-            </w:tcBorders>
-            <w:shd w:val="clear" w:fill="F4F4F7"/>
-          </w:tcPr>
-          <w:p>
-            <w:pPr>
-              <w:spacing w:before="50" w:after="50"/>
-            </w:pPr>
-            <w:r>
-              <w:rPr>
-                <w:sz w:val="15"/>
-              </w:rPr>
-            </w:r>
-          </w:p>
-        </w:tc>
-        <w:tc>
-          <w:tcPr>
-            <w:tcW w:type="dxa" w:w="2736"/>
-            <w:tcBorders>
-              <w:top w:val="single" w:sz="6" w:color="D9D9E0"/>
-              <w:left w:val="single" w:sz="6" w:color="D9D9E0"/>
-              <w:bottom w:val="single" w:sz="6" w:color="D9D9E0"/>
-              <w:right w:val="single" w:sz="6" w:color="D9D9E0"/>
-            </w:tcBorders>
-            <w:shd w:val="clear" w:fill="F4F4F7"/>
-          </w:tcPr>
-          <w:p>
-            <w:pPr>
-              <w:spacing w:before="50" w:after="50"/>
-            </w:pPr>
-            <w:r>
-              <w:rPr>
-                <w:sz w:val="15"/>
-              </w:rPr>
-            </w:r>
-          </w:p>
-        </w:tc>
-        <w:tc>
-          <w:tcPr>
-            <w:tcW w:type="dxa" w:w="864"/>
-            <w:tcBorders>
-              <w:top w:val="single" w:sz="6" w:color="D9D9E0"/>
-              <w:left w:val="single" w:sz="6" w:color="D9D9E0"/>
-              <w:bottom w:val="single" w:sz="6" w:color="D9D9E0"/>
-              <w:right w:val="single" w:sz="6" w:color="D9D9E0"/>
-            </w:tcBorders>
-            <w:shd w:val="clear" w:fill="F4F4F7"/>
-          </w:tcPr>
-          <w:p>
-            <w:pPr>
-              <w:spacing w:before="50" w:after="50"/>
-            </w:pPr>
-            <w:r>
-              <w:rPr>
-                <w:sz w:val="15"/>
-              </w:rPr>
-            </w:r>
-          </w:p>
-        </w:tc>
-        <w:tc>
-          <w:tcPr>
-            <w:tcW w:type="dxa" w:w="864"/>
-            <w:tcBorders>
-              <w:top w:val="single" w:sz="6" w:color="D9D9E0"/>
-              <w:left w:val="single" w:sz="6" w:color="D9D9E0"/>
-              <w:bottom w:val="single" w:sz="6" w:color="D9D9E0"/>
-              <w:right w:val="single" w:sz="6" w:color="D9D9E0"/>
-            </w:tcBorders>
-            <w:shd w:val="clear" w:fill="F4F4F7"/>
-          </w:tcPr>
-          <w:p>
-            <w:pPr>
-              <w:spacing w:before="50" w:after="50"/>
-            </w:pPr>
-            <w:r>
-              <w:rPr>
-                <w:sz w:val="15"/>
-              </w:rPr>
-            </w:r>
-          </w:p>
-        </w:tc>
-        <w:tc>
-          <w:tcPr>
-            <w:tcW w:type="dxa" w:w="2304"/>
-            <w:tcBorders>
-              <w:top w:val="single" w:sz="6" w:color="D9D9E0"/>
-              <w:left w:val="single" w:sz="6" w:color="D9D9E0"/>
-              <w:bottom w:val="single" w:sz="6" w:color="D9D9E0"/>
-              <w:right w:val="single" w:sz="6" w:color="D9D9E0"/>
-            </w:tcBorders>
-            <w:shd w:val="clear" w:fill="F4F4F7"/>
-          </w:tcPr>
-          <w:p>
-            <w:pPr>
-              <w:spacing w:before="50" w:after="50"/>
-            </w:pPr>
-            <w:r>
-              <w:rPr>
-                <w:sz w:val="15"/>
-              </w:rPr>
-            </w:r>
-          </w:p>
-        </w:tc>
-        <w:tc>
-          <w:tcPr>
-            <w:tcW w:type="dxa" w:w="1728"/>
-            <w:tcBorders>
-              <w:top w:val="single" w:sz="6" w:color="D9D9E0"/>
-              <w:left w:val="single" w:sz="6" w:color="D9D9E0"/>
-              <w:bottom w:val="single" w:sz="6" w:color="D9D9E0"/>
-              <w:right w:val="single" w:sz="6" w:color="D9D9E0"/>
-            </w:tcBorders>
-            <w:shd w:val="clear" w:fill="F4F4F7"/>
-          </w:tcPr>
-          <w:p>
-            <w:pPr>
-              <w:spacing w:before="50" w:after="50"/>
-            </w:pPr>
-            <w:r>
-              <w:rPr>
-                <w:sz w:val="15"/>
-              </w:rPr>
-            </w:r>
-          </w:p>
-        </w:tc>
-      </w:tr>
-      <w:tr>
-        <w:tc>
-          <w:tcPr>
-            <w:tcW w:type="dxa" w:w="1152"/>
-            <w:tcBorders>
-              <w:top w:val="single" w:sz="6" w:color="D9D9E0"/>
-              <w:left w:val="single" w:sz="6" w:color="D9D9E0"/>
-              <w:bottom w:val="single" w:sz="6" w:color="D9D9E0"/>
-              <w:right w:val="single" w:sz="6" w:color="D9D9E0"/>
-            </w:tcBorders>
-          </w:tcPr>
-          <w:p>
-            <w:pPr>
-              <w:spacing w:before="50" w:after="50"/>
-            </w:pPr>
-            <w:r>
-              <w:rPr>
-                <w:sz w:val="15"/>
-              </w:rPr>
-            </w:r>
-          </w:p>
-        </w:tc>
-        <w:tc>
-          <w:tcPr>
-            <w:tcW w:type="dxa" w:w="2736"/>
-            <w:tcBorders>
-              <w:top w:val="single" w:sz="6" w:color="D9D9E0"/>
-              <w:left w:val="single" w:sz="6" w:color="D9D9E0"/>
-              <w:bottom w:val="single" w:sz="6" w:color="D9D9E0"/>
-              <w:right w:val="single" w:sz="6" w:color="D9D9E0"/>
-            </w:tcBorders>
-          </w:tcPr>
-          <w:p>
-            <w:pPr>
-              <w:spacing w:before="50" w:after="50"/>
-            </w:pPr>
-            <w:r>
-              <w:rPr>
-                <w:sz w:val="15"/>
-              </w:rPr>
-            </w:r>
-          </w:p>
-        </w:tc>
-        <w:tc>
-          <w:tcPr>
-            <w:tcW w:type="dxa" w:w="864"/>
-            <w:tcBorders>
-              <w:top w:val="single" w:sz="6" w:color="D9D9E0"/>
-              <w:left w:val="single" w:sz="6" w:color="D9D9E0"/>
-              <w:bottom w:val="single" w:sz="6" w:color="D9D9E0"/>
-              <w:right w:val="single" w:sz="6" w:color="D9D9E0"/>
-            </w:tcBorders>
-          </w:tcPr>
-          <w:p>
-            <w:pPr>
-              <w:spacing w:before="50" w:after="50"/>
-            </w:pPr>
-            <w:r>
-              <w:rPr>
-                <w:sz w:val="15"/>
-              </w:rPr>
-            </w:r>
-          </w:p>
-        </w:tc>
-        <w:tc>
-          <w:tcPr>
-            <w:tcW w:type="dxa" w:w="864"/>
-            <w:tcBorders>
-              <w:top w:val="single" w:sz="6" w:color="D9D9E0"/>
-              <w:left w:val="single" w:sz="6" w:color="D9D9E0"/>
-              <w:bottom w:val="single" w:sz="6" w:color="D9D9E0"/>
-              <w:right w:val="single" w:sz="6" w:color="D9D9E0"/>
-            </w:tcBorders>
-          </w:tcPr>
-          <w:p>
-            <w:pPr>
-              <w:spacing w:before="50" w:after="50"/>
-            </w:pPr>
-            <w:r>
-              <w:rPr>
-                <w:sz w:val="15"/>
-              </w:rPr>
-            </w:r>
-          </w:p>
-        </w:tc>
-        <w:tc>
-          <w:tcPr>
-            <w:tcW w:type="dxa" w:w="2304"/>
-            <w:tcBorders>
-              <w:top w:val="single" w:sz="6" w:color="D9D9E0"/>
-              <w:left w:val="single" w:sz="6" w:color="D9D9E0"/>
-              <w:bottom w:val="single" w:sz="6" w:color="D9D9E0"/>
-              <w:right w:val="single" w:sz="6" w:color="D9D9E0"/>
-            </w:tcBorders>
-          </w:tcPr>
-          <w:p>
-            <w:pPr>
-              <w:spacing w:before="50" w:after="50"/>
-            </w:pPr>
-            <w:r>
-              <w:rPr>
-                <w:sz w:val="15"/>
-              </w:rPr>
-            </w:r>
-          </w:p>
-        </w:tc>
-        <w:tc>
-          <w:tcPr>
-            <w:tcW w:type="dxa" w:w="1728"/>
-            <w:tcBorders>
-              <w:top w:val="single" w:sz="6" w:color="D9D9E0"/>
-              <w:left w:val="single" w:sz="6" w:color="D9D9E0"/>
-              <w:bottom w:val="single" w:sz="6" w:color="D9D9E0"/>
-              <w:right w:val="single" w:sz="6" w:color="D9D9E0"/>
-            </w:tcBorders>
-          </w:tcPr>
-          <w:p>
-            <w:pPr>
-              <w:spacing w:before="50" w:after="50"/>
-            </w:pPr>
-            <w:r>
-              <w:rPr>
-                <w:sz w:val="15"/>
-              </w:rPr>
-            </w:r>
-          </w:p>
-        </w:tc>
-      </w:tr>
-      <w:tr>
-        <w:tc>
-          <w:tcPr>
-            <w:tcW w:type="dxa" w:w="1152"/>
-            <w:tcBorders>
-              <w:top w:val="single" w:sz="6" w:color="D9D9E0"/>
-              <w:left w:val="single" w:sz="6" w:color="D9D9E0"/>
-              <w:bottom w:val="single" w:sz="6" w:color="D9D9E0"/>
-              <w:right w:val="single" w:sz="6" w:color="D9D9E0"/>
-            </w:tcBorders>
-            <w:shd w:val="clear" w:fill="F4F4F7"/>
-          </w:tcPr>
-          <w:p>
-            <w:pPr>
-              <w:spacing w:before="50" w:after="50"/>
-            </w:pPr>
-            <w:r>
-              <w:rPr>
-                <w:sz w:val="15"/>
-              </w:rPr>
-            </w:r>
-          </w:p>
-        </w:tc>
-        <w:tc>
-          <w:tcPr>
-            <w:tcW w:type="dxa" w:w="2736"/>
-            <w:tcBorders>
-              <w:top w:val="single" w:sz="6" w:color="D9D9E0"/>
-              <w:left w:val="single" w:sz="6" w:color="D9D9E0"/>
-              <w:bottom w:val="single" w:sz="6" w:color="D9D9E0"/>
-              <w:right w:val="single" w:sz="6" w:color="D9D9E0"/>
-            </w:tcBorders>
-            <w:shd w:val="clear" w:fill="F4F4F7"/>
-          </w:tcPr>
-          <w:p>
-            <w:pPr>
-              <w:spacing w:before="50" w:after="50"/>
-            </w:pPr>
-            <w:r>
-              <w:rPr>
-                <w:sz w:val="15"/>
-              </w:rPr>
-            </w:r>
-          </w:p>
-        </w:tc>
-        <w:tc>
-          <w:tcPr>
-            <w:tcW w:type="dxa" w:w="864"/>
-            <w:tcBorders>
-              <w:top w:val="single" w:sz="6" w:color="D9D9E0"/>
-              <w:left w:val="single" w:sz="6" w:color="D9D9E0"/>
-              <w:bottom w:val="single" w:sz="6" w:color="D9D9E0"/>
-              <w:right w:val="single" w:sz="6" w:color="D9D9E0"/>
-            </w:tcBorders>
-            <w:shd w:val="clear" w:fill="F4F4F7"/>
-          </w:tcPr>
-          <w:p>
-            <w:pPr>
-              <w:spacing w:before="50" w:after="50"/>
-            </w:pPr>
-            <w:r>
-              <w:rPr>
-                <w:sz w:val="15"/>
-              </w:rPr>
-            </w:r>
-          </w:p>
-        </w:tc>
-        <w:tc>
-          <w:tcPr>
-            <w:tcW w:type="dxa" w:w="864"/>
-            <w:tcBorders>
-              <w:top w:val="single" w:sz="6" w:color="D9D9E0"/>
-              <w:left w:val="single" w:sz="6" w:color="D9D9E0"/>
-              <w:bottom w:val="single" w:sz="6" w:color="D9D9E0"/>
-              <w:right w:val="single" w:sz="6" w:color="D9D9E0"/>
-            </w:tcBorders>
-            <w:shd w:val="clear" w:fill="F4F4F7"/>
-          </w:tcPr>
-          <w:p>
-            <w:pPr>
-              <w:spacing w:before="50" w:after="50"/>
-            </w:pPr>
-            <w:r>
-              <w:rPr>
-                <w:sz w:val="15"/>
-              </w:rPr>
-            </w:r>
-          </w:p>
-        </w:tc>
-        <w:tc>
-          <w:tcPr>
-            <w:tcW w:type="dxa" w:w="2304"/>
-            <w:tcBorders>
-              <w:top w:val="single" w:sz="6" w:color="D9D9E0"/>
-              <w:left w:val="single" w:sz="6" w:color="D9D9E0"/>
-              <w:bottom w:val="single" w:sz="6" w:color="D9D9E0"/>
-              <w:right w:val="single" w:sz="6" w:color="D9D9E0"/>
-            </w:tcBorders>
-            <w:shd w:val="clear" w:fill="F4F4F7"/>
-          </w:tcPr>
-          <w:p>
-            <w:pPr>
-              <w:spacing w:before="50" w:after="50"/>
-            </w:pPr>
-            <w:r>
-              <w:rPr>
-                <w:sz w:val="15"/>
-              </w:rPr>
-            </w:r>
-          </w:p>
-        </w:tc>
-        <w:tc>
-          <w:tcPr>
-            <w:tcW w:type="dxa" w:w="1728"/>
-            <w:tcBorders>
-              <w:top w:val="single" w:sz="6" w:color="D9D9E0"/>
-              <w:left w:val="single" w:sz="6" w:color="D9D9E0"/>
-              <w:bottom w:val="single" w:sz="6" w:color="D9D9E0"/>
-              <w:right w:val="single" w:sz="6" w:color="D9D9E0"/>
-            </w:tcBorders>
-            <w:shd w:val="clear" w:fill="F4F4F7"/>
-          </w:tcPr>
-          <w:p>
-            <w:pPr>
-              <w:spacing w:before="50" w:after="50"/>
-            </w:pPr>
-            <w:r>
-              <w:rPr>
-                <w:sz w:val="15"/>
-              </w:rPr>
-            </w:r>
-          </w:p>
-        </w:tc>
-      </w:tr>
-      <w:tr>
-        <w:tc>
-          <w:tcPr>
-            <w:tcW w:type="dxa" w:w="1152"/>
-            <w:tcBorders>
-              <w:top w:val="single" w:sz="6" w:color="D9D9E0"/>
-              <w:left w:val="single" w:sz="6" w:color="D9D9E0"/>
-              <w:bottom w:val="single" w:sz="6" w:color="D9D9E0"/>
-              <w:right w:val="single" w:sz="6" w:color="D9D9E0"/>
-            </w:tcBorders>
-          </w:tcPr>
-          <w:p>
-            <w:pPr>
-              <w:spacing w:before="50" w:after="50"/>
-            </w:pPr>
-            <w:r>
-              <w:rPr>
-                <w:sz w:val="15"/>
-              </w:rPr>
-            </w:r>
-          </w:p>
-        </w:tc>
-        <w:tc>
-          <w:tcPr>
-            <w:tcW w:type="dxa" w:w="2736"/>
-            <w:tcBorders>
-              <w:top w:val="single" w:sz="6" w:color="D9D9E0"/>
-              <w:left w:val="single" w:sz="6" w:color="D9D9E0"/>
-              <w:bottom w:val="single" w:sz="6" w:color="D9D9E0"/>
-              <w:right w:val="single" w:sz="6" w:color="D9D9E0"/>
-            </w:tcBorders>
-          </w:tcPr>
-          <w:p>
-            <w:pPr>
-              <w:spacing w:before="50" w:after="50"/>
-            </w:pPr>
-            <w:r>
-              <w:rPr>
-                <w:sz w:val="15"/>
-              </w:rPr>
-            </w:r>
-          </w:p>
-        </w:tc>
-        <w:tc>
-          <w:tcPr>
-            <w:tcW w:type="dxa" w:w="864"/>
-            <w:tcBorders>
-              <w:top w:val="single" w:sz="6" w:color="D9D9E0"/>
-              <w:left w:val="single" w:sz="6" w:color="D9D9E0"/>
-              <w:bottom w:val="single" w:sz="6" w:color="D9D9E0"/>
-              <w:right w:val="single" w:sz="6" w:color="D9D9E0"/>
-            </w:tcBorders>
-          </w:tcPr>
-          <w:p>
-            <w:pPr>
-              <w:spacing w:before="50" w:after="50"/>
-            </w:pPr>
-            <w:r>
-              <w:rPr>
-                <w:sz w:val="15"/>
-              </w:rPr>
-            </w:r>
-          </w:p>
-        </w:tc>
-        <w:tc>
-          <w:tcPr>
-            <w:tcW w:type="dxa" w:w="864"/>
-            <w:tcBorders>
-              <w:top w:val="single" w:sz="6" w:color="D9D9E0"/>
-              <w:left w:val="single" w:sz="6" w:color="D9D9E0"/>
-              <w:bottom w:val="single" w:sz="6" w:color="D9D9E0"/>
-              <w:right w:val="single" w:sz="6" w:color="D9D9E0"/>
-            </w:tcBorders>
-          </w:tcPr>
-          <w:p>
-            <w:pPr>
-              <w:spacing w:before="50" w:after="50"/>
-            </w:pPr>
-            <w:r>
-              <w:rPr>
-                <w:sz w:val="15"/>
-              </w:rPr>
-            </w:r>
-          </w:p>
-        </w:tc>
-        <w:tc>
-          <w:tcPr>
-            <w:tcW w:type="dxa" w:w="2304"/>
-            <w:tcBorders>
-              <w:top w:val="single" w:sz="6" w:color="D9D9E0"/>
-              <w:left w:val="single" w:sz="6" w:color="D9D9E0"/>
-              <w:bottom w:val="single" w:sz="6" w:color="D9D9E0"/>
-              <w:right w:val="single" w:sz="6" w:color="D9D9E0"/>
-            </w:tcBorders>
-          </w:tcPr>
-          <w:p>
-            <w:pPr>
-              <w:spacing w:before="50" w:after="50"/>
-            </w:pPr>
-            <w:r>
-              <w:rPr>
-                <w:sz w:val="15"/>
-              </w:rPr>
-            </w:r>
-          </w:p>
-        </w:tc>
-        <w:tc>
-          <w:tcPr>
-            <w:tcW w:type="dxa" w:w="1728"/>
-            <w:tcBorders>
-              <w:top w:val="single" w:sz="6" w:color="D9D9E0"/>
-              <w:left w:val="single" w:sz="6" w:color="D9D9E0"/>
-              <w:bottom w:val="single" w:sz="6" w:color="D9D9E0"/>
-              <w:right w:val="single" w:sz="6" w:color="D9D9E0"/>
-            </w:tcBorders>
-          </w:tcPr>
-          <w:p>
-            <w:pPr>
-              <w:spacing w:before="50" w:after="50"/>
-            </w:pPr>
-            <w:r>
-              <w:rPr>
-                <w:sz w:val="15"/>
-              </w:rPr>
-            </w:r>
-          </w:p>
-        </w:tc>
-      </w:tr>
-      <w:tr>
-        <w:tc>
-          <w:tcPr>
-            <w:tcW w:type="dxa" w:w="1152"/>
-            <w:tcBorders>
-              <w:top w:val="single" w:sz="6" w:color="D9D9E0"/>
-              <w:left w:val="single" w:sz="6" w:color="D9D9E0"/>
-              <w:bottom w:val="single" w:sz="6" w:color="D9D9E0"/>
-              <w:right w:val="single" w:sz="6" w:color="D9D9E0"/>
-            </w:tcBorders>
-            <w:shd w:val="clear" w:fill="F4F4F7"/>
-          </w:tcPr>
-          <w:p>
-            <w:pPr>
-              <w:spacing w:before="50" w:after="50"/>
-            </w:pPr>
-            <w:r>
-              <w:rPr>
-                <w:sz w:val="15"/>
-              </w:rPr>
-            </w:r>
-          </w:p>
-        </w:tc>
-        <w:tc>
-          <w:tcPr>
-            <w:tcW w:type="dxa" w:w="2736"/>
-            <w:tcBorders>
-              <w:top w:val="single" w:sz="6" w:color="D9D9E0"/>
-              <w:left w:val="single" w:sz="6" w:color="D9D9E0"/>
-              <w:bottom w:val="single" w:sz="6" w:color="D9D9E0"/>
-              <w:right w:val="single" w:sz="6" w:color="D9D9E0"/>
-            </w:tcBorders>
-            <w:shd w:val="clear" w:fill="F4F4F7"/>
-          </w:tcPr>
-          <w:p>
-            <w:pPr>
-              <w:spacing w:before="50" w:after="50"/>
-            </w:pPr>
-            <w:r>
-              <w:rPr>
-                <w:sz w:val="15"/>
-              </w:rPr>
-            </w:r>
-          </w:p>
-        </w:tc>
-        <w:tc>
-          <w:tcPr>
-            <w:tcW w:type="dxa" w:w="864"/>
-            <w:tcBorders>
-              <w:top w:val="single" w:sz="6" w:color="D9D9E0"/>
-              <w:left w:val="single" w:sz="6" w:color="D9D9E0"/>
-              <w:bottom w:val="single" w:sz="6" w:color="D9D9E0"/>
-              <w:right w:val="single" w:sz="6" w:color="D9D9E0"/>
-            </w:tcBorders>
-            <w:shd w:val="clear" w:fill="F4F4F7"/>
-          </w:tcPr>
-          <w:p>
-            <w:pPr>
-              <w:spacing w:before="50" w:after="50"/>
-            </w:pPr>
-            <w:r>
-              <w:rPr>
-                <w:sz w:val="15"/>
-              </w:rPr>
-            </w:r>
-          </w:p>
-        </w:tc>
-        <w:tc>
-          <w:tcPr>
-            <w:tcW w:type="dxa" w:w="864"/>
-            <w:tcBorders>
-              <w:top w:val="single" w:sz="6" w:color="D9D9E0"/>
-              <w:left w:val="single" w:sz="6" w:color="D9D9E0"/>
-              <w:bottom w:val="single" w:sz="6" w:color="D9D9E0"/>
-              <w:right w:val="single" w:sz="6" w:color="D9D9E0"/>
-            </w:tcBorders>
-            <w:shd w:val="clear" w:fill="F4F4F7"/>
-          </w:tcPr>
-          <w:p>
-            <w:pPr>
-              <w:spacing w:before="50" w:after="50"/>
-            </w:pPr>
-            <w:r>
-              <w:rPr>
-                <w:sz w:val="15"/>
-              </w:rPr>
-            </w:r>
-          </w:p>
-        </w:tc>
-        <w:tc>
-          <w:tcPr>
-            <w:tcW w:type="dxa" w:w="2304"/>
-            <w:tcBorders>
-              <w:top w:val="single" w:sz="6" w:color="D9D9E0"/>
-              <w:left w:val="single" w:sz="6" w:color="D9D9E0"/>
-              <w:bottom w:val="single" w:sz="6" w:color="D9D9E0"/>
-              <w:right w:val="single" w:sz="6" w:color="D9D9E0"/>
-            </w:tcBorders>
-            <w:shd w:val="clear" w:fill="F4F4F7"/>
-          </w:tcPr>
-          <w:p>
-            <w:pPr>
-              <w:spacing w:before="50" w:after="50"/>
-            </w:pPr>
-            <w:r>
-              <w:rPr>
-                <w:sz w:val="15"/>
-              </w:rPr>
-            </w:r>
-          </w:p>
-        </w:tc>
-        <w:tc>
-          <w:tcPr>
-            <w:tcW w:type="dxa" w:w="1728"/>
-            <w:tcBorders>
-              <w:top w:val="single" w:sz="6" w:color="D9D9E0"/>
-              <w:left w:val="single" w:sz="6" w:color="D9D9E0"/>
-              <w:bottom w:val="single" w:sz="6" w:color="D9D9E0"/>
-              <w:right w:val="single" w:sz="6" w:color="D9D9E0"/>
-            </w:tcBorders>
-            <w:shd w:val="clear" w:fill="F4F4F7"/>
-          </w:tcPr>
-          <w:p>
-            <w:pPr>
-              <w:spacing w:before="50" w:after="50"/>
-            </w:pPr>
-            <w:r>
-              <w:rPr>
-                <w:sz w:val="15"/>
-              </w:rPr>
-            </w:r>
-          </w:p>
-        </w:tc>
-      </w:tr>
-      <w:tr>
-        <w:tc>
-          <w:tcPr>
-            <w:tcW w:type="dxa" w:w="1152"/>
-            <w:tcBorders>
-              <w:top w:val="single" w:sz="6" w:color="D9D9E0"/>
-              <w:left w:val="single" w:sz="6" w:color="D9D9E0"/>
-              <w:bottom w:val="single" w:sz="6" w:color="D9D9E0"/>
-              <w:right w:val="single" w:sz="6" w:color="D9D9E0"/>
-            </w:tcBorders>
-          </w:tcPr>
-          <w:p>
-            <w:pPr>
-              <w:spacing w:before="50" w:after="50"/>
-            </w:pPr>
-            <w:r>
-              <w:rPr>
-                <w:sz w:val="15"/>
-              </w:rPr>
-            </w:r>
-          </w:p>
-        </w:tc>
-        <w:tc>
-          <w:tcPr>
-            <w:tcW w:type="dxa" w:w="2736"/>
-            <w:tcBorders>
-              <w:top w:val="single" w:sz="6" w:color="D9D9E0"/>
-              <w:left w:val="single" w:sz="6" w:color="D9D9E0"/>
-              <w:bottom w:val="single" w:sz="6" w:color="D9D9E0"/>
-              <w:right w:val="single" w:sz="6" w:color="D9D9E0"/>
-            </w:tcBorders>
-          </w:tcPr>
-          <w:p>
-            <w:pPr>
-              <w:spacing w:before="50" w:after="50"/>
-            </w:pPr>
-            <w:r>
-              <w:rPr>
-                <w:sz w:val="15"/>
-              </w:rPr>
-            </w:r>
-          </w:p>
-        </w:tc>
-        <w:tc>
-          <w:tcPr>
-            <w:tcW w:type="dxa" w:w="864"/>
-            <w:tcBorders>
-              <w:top w:val="single" w:sz="6" w:color="D9D9E0"/>
-              <w:left w:val="single" w:sz="6" w:color="D9D9E0"/>
-              <w:bottom w:val="single" w:sz="6" w:color="D9D9E0"/>
-              <w:right w:val="single" w:sz="6" w:color="D9D9E0"/>
-            </w:tcBorders>
-          </w:tcPr>
-          <w:p>
-            <w:pPr>
-              <w:spacing w:before="50" w:after="50"/>
-            </w:pPr>
-            <w:r>
-              <w:rPr>
-                <w:sz w:val="15"/>
-              </w:rPr>
-            </w:r>
-          </w:p>
-        </w:tc>
-        <w:tc>
-          <w:tcPr>
-            <w:tcW w:type="dxa" w:w="864"/>
-            <w:tcBorders>
-              <w:top w:val="single" w:sz="6" w:color="D9D9E0"/>
-              <w:left w:val="single" w:sz="6" w:color="D9D9E0"/>
-              <w:bottom w:val="single" w:sz="6" w:color="D9D9E0"/>
-              <w:right w:val="single" w:sz="6" w:color="D9D9E0"/>
-            </w:tcBorders>
-          </w:tcPr>
-          <w:p>
-            <w:pPr>
-              <w:spacing w:before="50" w:after="50"/>
-            </w:pPr>
-            <w:r>
-              <w:rPr>
-                <w:sz w:val="15"/>
-              </w:rPr>
-            </w:r>
-          </w:p>
-        </w:tc>
-        <w:tc>
-          <w:tcPr>
-            <w:tcW w:type="dxa" w:w="2304"/>
-            <w:tcBorders>
-              <w:top w:val="single" w:sz="6" w:color="D9D9E0"/>
-              <w:left w:val="single" w:sz="6" w:color="D9D9E0"/>
-              <w:bottom w:val="single" w:sz="6" w:color="D9D9E0"/>
-              <w:right w:val="single" w:sz="6" w:color="D9D9E0"/>
-            </w:tcBorders>
-          </w:tcPr>
-          <w:p>
-            <w:pPr>
-              <w:spacing w:before="50" w:after="50"/>
-            </w:pPr>
-            <w:r>
-              <w:rPr>
-                <w:sz w:val="15"/>
-              </w:rPr>
-            </w:r>
-          </w:p>
-        </w:tc>
-        <w:tc>
-          <w:tcPr>
-            <w:tcW w:type="dxa" w:w="1728"/>
-            <w:tcBorders>
-              <w:top w:val="single" w:sz="6" w:color="D9D9E0"/>
-              <w:left w:val="single" w:sz="6" w:color="D9D9E0"/>
-              <w:bottom w:val="single" w:sz="6" w:color="D9D9E0"/>
-              <w:right w:val="single" w:sz="6" w:color="D9D9E0"/>
-            </w:tcBorders>
-          </w:tcPr>
-          <w:p>
-            <w:pPr>
-              <w:spacing w:before="50" w:after="50"/>
-            </w:pPr>
-            <w:r>
-              <w:rPr>
-                <w:sz w:val="15"/>
-              </w:rPr>
+            <w:r>
+              <w:t>None.</w:t>
             </w:r>
           </w:p>
         </w:tc>
@@ -10458,11 +9480,8 @@
             </w:tcBorders>
           </w:tcPr>
           <w:p>
-            <w:pPr>
-              <w:spacing w:before="50" w:after="50"/>
-            </w:pPr>
-            <w:r>
-              <w:t>2026-09-18</w:t>
+            <w:r>
+              <w:t>2026-09-21</w:t>
             </w:r>
           </w:p>
         </w:tc>
@@ -10477,11 +9496,8 @@
             </w:tcBorders>
           </w:tcPr>
           <w:p>
-            <w:pPr>
-              <w:spacing w:before="50" w:after="50"/>
-            </w:pPr>
-            <w:r>
-              <w:t>~94.5 (34.5 recorded in week one; 60 estimated across weeks two and three from commit spans)</w:t>
+            <w:r>
+              <w:t>~113.5 (34.5 recorded in week one; 79 estimated across weeks two and three from commit spans)</w:t>
             </w:r>
           </w:p>
         </w:tc>

</xml_diff>

<commit_message>
docs: effort log week four, 23-27 Sep, and the totals it changes
Five entries: D-17 and the local runs on 23 Sep, the 410-ticket run on
24 Sep, and three 27 Sep entries for the results-table and Windows
fixes, the final runs and report, and the deck, video and calibration
changes. Hours were given by the maintainer from recollection (2, 2 and
8), not from commit spans, and the details note says so.

Stage 5 goes to 71.5, stage 7 to 6.5; the actuals sum to the 125.5 the
declaration states. Submission date updated to 27 Sep.

Co-Authored-By: Claude Opus 5.5 <noreply@anthropic.com>
</commit_message>
<xml_diff>
--- a/workbooks/Effort_Log.docx
+++ b/workbooks/Effort_Log.docx
@@ -386,7 +386,7 @@
               <w:spacing w:before="50" w:after="50"/>
             </w:pPr>
             <w:r>
-              <w:t>2026-09-20 (moved from 2026-09-13)</w:t>
+              <w:t xml:space="preserve">2026-09-27 (moved from 2026-09-13, then from 2026-09-20)</w:t>
             </w:r>
           </w:p>
         </w:tc>
@@ -474,7 +474,7 @@
           </w:tcPr>
           <w:p>
             <w:r>
-              <w:t>Individual project. Free-tier tooling throughout. Companion session used for planning, drafting, review, and code scaffolding. Weeks two and three were reconstructed on 2026-09-18 from git history and the Stage 4 daily check-ins; no contemporaneous hours were recorded for those weeks, so their hours are estimates from commit spans and are marked '(est.)'; the 19-21 September entries were reconstructed the same way on 2026-09-21.</w:t>
+              <w:t xml:space="preserve">Individual project. Free-tier tooling throughout. Companion session used for planning, drafting, review, and code scaffolding. Weeks two and three were reconstructed on 2026-09-18 from git history and the Stage 4 daily check-ins; no contemporaneous hours were recorded for those weeks, so their hours are estimates from commit spans and are marked '(est.)'; the 19-21 September entries were reconstructed the same way on 2026-09-21. Hours for 23-27 September were given by the maintainer on 2026-09-27 from recollection (2 hours on each of 23 and 24 September, 8 on 27 September), not from commit spans; the split of the 8 hours across the three 27 September entries is by time of day.</w:t>
             </w:r>
           </w:p>
         </w:tc>
@@ -1150,7 +1150,7 @@
           </w:tcPr>
           <w:p>
             <w:r>
-              <w:t>63.5</w:t>
+              <w:t xml:space="preserve">71.5</w:t>
             </w:r>
           </w:p>
         </w:tc>
@@ -1166,7 +1166,7 @@
           </w:tcPr>
           <w:p>
             <w:r>
-              <w:t>+23.5</w:t>
+              <w:t xml:space="preserve">+31.5</w:t>
             </w:r>
           </w:p>
         </w:tc>
@@ -1182,7 +1182,7 @@
           </w:tcPr>
           <w:p>
             <w:r>
-              <w:t>Reconstructed from git history (see weeks two and three). The overrun is evaluation, not components: the harness, three 80-ticket runs, the retrieval and ground-truth evaluations, the prompt A/B and the judge calibration. 19-20 Sep added caching and pacing (D-08), the wall-clock bound (D-13), concurrent guardrails (D-12), the retrieval, PII and routing corrections (D-09, D-10, D-11, D-14) and the B-29 service.</w:t>
+              <w:t xml:space="preserve">Reconstructed from git history (see weeks two and three). The overrun is evaluation, not components: the harness, three 80-ticket runs, the retrieval and ground-truth evaluations, the prompt A/B and the judge calibration. 19-20 Sep added caching and pacing (D-08), the wall-clock bound (D-13), concurrent guardrails (D-12), the retrieval, PII and routing corrections (D-09, D-10, D-11, D-14) and the B-29 service. 23-27 Sep added the D-17 urgency-first queue, the 10-, 80- and 410-ticket local runs, the results-table additions, the Windows UTF-8 fix and the two final runs.</w:t>
             </w:r>
           </w:p>
         </w:tc>
@@ -1337,7 +1337,7 @@
           </w:tcPr>
           <w:p>
             <w:r>
-              <w:t>2.5</w:t>
+              <w:t xml:space="preserve">6.5</w:t>
             </w:r>
           </w:p>
         </w:tc>
@@ -1353,7 +1353,7 @@
           </w:tcPr>
           <w:p>
             <w:r>
-              <w:t>-9.5</w:t>
+              <w:t xml:space="preserve">-5.5</w:t>
             </w:r>
           </w:p>
         </w:tc>
@@ -1369,7 +1369,7 @@
           </w:tcPr>
           <w:p>
             <w:r>
-              <w:t>Report compiled 20 Sep and committed to submission/02_Report. B-26 video not started, which is most of the remaining estimate.</w:t>
+              <w:t xml:space="preserve">Report compiled 20 Sep and rebuilt 27 Sep from the final runs. Presentation deck, diagrams and the B-26 video done 27 Sep.</w:t>
             </w:r>
           </w:p>
         </w:tc>
@@ -8248,6 +8248,788 @@
           <w:color w:val="1A1A2E"/>
           <w:sz w:val="34"/>
         </w:rPr>
+        <w:t>Week four: daily entries</w:t>
+      </w:r>
+    </w:p>
+    <w:tbl>
+      <w:tblPr>
+        <w:tblW w:type="auto" w:w="0"/>
+        <w:jc w:val="center"/>
+        <w:tblLayout w:type="fixed"/>
+        <w:tblLook w:firstColumn="1" w:firstRow="1" w:lastColumn="0" w:lastRow="0" w:noHBand="0" w:noVBand="1" w:val="04A0"/>
+      </w:tblPr>
+      <w:tblGrid>
+        <w:gridCol w:w="1608"/>
+        <w:gridCol w:w="1608"/>
+        <w:gridCol w:w="1608"/>
+        <w:gridCol w:w="1608"/>
+        <w:gridCol w:w="1608"/>
+        <w:gridCol w:w="1608"/>
+      </w:tblGrid>
+      <w:tr>
+        <w:tc>
+          <w:tcPr>
+            <w:tcW w:type="dxa" w:w="1152"/>
+            <w:shd w:val="clear" w:fill="E8660A"/>
+            <w:tcBorders>
+              <w:top w:val="single" w:sz="6" w:color="D9D9E0"/>
+              <w:left w:val="single" w:sz="6" w:color="D9D9E0"/>
+              <w:bottom w:val="single" w:sz="6" w:color="D9D9E0"/>
+              <w:right w:val="single" w:sz="6" w:color="D9D9E0"/>
+            </w:tcBorders>
+          </w:tcPr>
+          <w:p>
+            <w:pPr>
+              <w:spacing w:before="60" w:after="60"/>
+            </w:pPr>
+            <w:r>
+              <w:rPr>
+                <w:b/>
+                <w:color w:val="FFFFFF"/>
+                <w:sz w:val="16"/>
+              </w:rPr>
+              <w:t>Date</w:t>
+            </w:r>
+          </w:p>
+        </w:tc>
+        <w:tc>
+          <w:tcPr>
+            <w:tcW w:type="dxa" w:w="2736"/>
+            <w:shd w:val="clear" w:fill="E8660A"/>
+            <w:tcBorders>
+              <w:top w:val="single" w:sz="6" w:color="D9D9E0"/>
+              <w:left w:val="single" w:sz="6" w:color="D9D9E0"/>
+              <w:bottom w:val="single" w:sz="6" w:color="D9D9E0"/>
+              <w:right w:val="single" w:sz="6" w:color="D9D9E0"/>
+            </w:tcBorders>
+          </w:tcPr>
+          <w:p>
+            <w:pPr>
+              <w:spacing w:before="60" w:after="60"/>
+            </w:pPr>
+            <w:r>
+              <w:rPr>
+                <w:b/>
+                <w:color w:val="FFFFFF"/>
+                <w:sz w:val="16"/>
+              </w:rPr>
+              <w:t>Task</w:t>
+            </w:r>
+          </w:p>
+        </w:tc>
+        <w:tc>
+          <w:tcPr>
+            <w:tcW w:type="dxa" w:w="864"/>
+            <w:shd w:val="clear" w:fill="E8660A"/>
+            <w:tcBorders>
+              <w:top w:val="single" w:sz="6" w:color="D9D9E0"/>
+              <w:left w:val="single" w:sz="6" w:color="D9D9E0"/>
+              <w:bottom w:val="single" w:sz="6" w:color="D9D9E0"/>
+              <w:right w:val="single" w:sz="6" w:color="D9D9E0"/>
+            </w:tcBorders>
+          </w:tcPr>
+          <w:p>
+            <w:pPr>
+              <w:spacing w:before="60" w:after="60"/>
+            </w:pPr>
+            <w:r>
+              <w:rPr>
+                <w:b/>
+                <w:color w:val="FFFFFF"/>
+                <w:sz w:val="16"/>
+              </w:rPr>
+              <w:t>Stage</w:t>
+            </w:r>
+          </w:p>
+        </w:tc>
+        <w:tc>
+          <w:tcPr>
+            <w:tcW w:type="dxa" w:w="864"/>
+            <w:shd w:val="clear" w:fill="E8660A"/>
+            <w:tcBorders>
+              <w:top w:val="single" w:sz="6" w:color="D9D9E0"/>
+              <w:left w:val="single" w:sz="6" w:color="D9D9E0"/>
+              <w:bottom w:val="single" w:sz="6" w:color="D9D9E0"/>
+              <w:right w:val="single" w:sz="6" w:color="D9D9E0"/>
+            </w:tcBorders>
+          </w:tcPr>
+          <w:p>
+            <w:pPr>
+              <w:spacing w:before="60" w:after="60"/>
+            </w:pPr>
+            <w:r>
+              <w:rPr>
+                <w:b/>
+                <w:color w:val="FFFFFF"/>
+                <w:sz w:val="16"/>
+              </w:rPr>
+              <w:t>Hours</w:t>
+            </w:r>
+          </w:p>
+        </w:tc>
+        <w:tc>
+          <w:tcPr>
+            <w:tcW w:type="dxa" w:w="2304"/>
+            <w:shd w:val="clear" w:fill="E8660A"/>
+            <w:tcBorders>
+              <w:top w:val="single" w:sz="6" w:color="D9D9E0"/>
+              <w:left w:val="single" w:sz="6" w:color="D9D9E0"/>
+              <w:bottom w:val="single" w:sz="6" w:color="D9D9E0"/>
+              <w:right w:val="single" w:sz="6" w:color="D9D9E0"/>
+            </w:tcBorders>
+          </w:tcPr>
+          <w:p>
+            <w:pPr>
+              <w:spacing w:before="60" w:after="60"/>
+            </w:pPr>
+            <w:r>
+              <w:rPr>
+                <w:b/>
+                <w:color w:val="FFFFFF"/>
+                <w:sz w:val="16"/>
+              </w:rPr>
+              <w:t>What it produced</w:t>
+            </w:r>
+          </w:p>
+        </w:tc>
+        <w:tc>
+          <w:tcPr>
+            <w:tcW w:type="dxa" w:w="1728"/>
+            <w:shd w:val="clear" w:fill="E8660A"/>
+            <w:tcBorders>
+              <w:top w:val="single" w:sz="6" w:color="D9D9E0"/>
+              <w:left w:val="single" w:sz="6" w:color="D9D9E0"/>
+              <w:bottom w:val="single" w:sz="6" w:color="D9D9E0"/>
+              <w:right w:val="single" w:sz="6" w:color="D9D9E0"/>
+            </w:tcBorders>
+          </w:tcPr>
+          <w:p>
+            <w:pPr>
+              <w:spacing w:before="60" w:after="60"/>
+            </w:pPr>
+            <w:r>
+              <w:rPr>
+                <w:b/>
+                <w:color w:val="FFFFFF"/>
+                <w:sz w:val="16"/>
+              </w:rPr>
+              <w:t>Blocked by anything?</w:t>
+            </w:r>
+          </w:p>
+        </w:tc>
+      </w:tr>
+      <w:tr>
+        <w:tc>
+          <w:tcPr>
+            <w:tcW w:type="dxa" w:w="1152"/>
+            <w:tcBorders>
+              <w:top w:val="single" w:sz="6" w:color="D9D9E0"/>
+              <w:left w:val="single" w:sz="6" w:color="D9D9E0"/>
+              <w:bottom w:val="single" w:sz="6" w:color="D9D9E0"/>
+              <w:right w:val="single" w:sz="6" w:color="D9D9E0"/>
+            </w:tcBorders>
+          </w:tcPr>
+          <w:p>
+            <w:pPr>
+              <w:spacing w:before="50" w:after="50"/>
+            </w:pPr>
+            <w:r>
+              <w:t xml:space="preserve">2026-09-23</w:t>
+            </w:r>
+          </w:p>
+        </w:tc>
+        <w:tc>
+          <w:tcPr>
+            <w:tcW w:type="dxa" w:w="2736"/>
+            <w:tcBorders>
+              <w:top w:val="single" w:sz="6" w:color="D9D9E0"/>
+              <w:left w:val="single" w:sz="6" w:color="D9D9E0"/>
+              <w:bottom w:val="single" w:sz="6" w:color="D9D9E0"/>
+              <w:right w:val="single" w:sz="6" w:color="D9D9E0"/>
+            </w:tcBorders>
+          </w:tcPr>
+          <w:p>
+            <w:pPr>
+              <w:spacing w:before="50" w:after="50"/>
+            </w:pPr>
+            <w:r>
+              <w:t xml:space="preserve">D-17 urgency-first harness queue: every ticket is classified first and high-urgency tickets are worked first, on the harness's own classifier rating rather than the labels, so a run that stops early has spent its quota on the tickets that matter most. Local Ollama runs (llama3.1-8b + qwen2.5-7b): 10 tickets, 80 development tickets and the ground-truth check, then a 410-ticket development run started at 00:47.</w:t>
+            </w:r>
+          </w:p>
+        </w:tc>
+        <w:tc>
+          <w:tcPr>
+            <w:tcW w:type="dxa" w:w="864"/>
+            <w:tcBorders>
+              <w:top w:val="single" w:sz="6" w:color="D9D9E0"/>
+              <w:left w:val="single" w:sz="6" w:color="D9D9E0"/>
+              <w:bottom w:val="single" w:sz="6" w:color="D9D9E0"/>
+              <w:right w:val="single" w:sz="6" w:color="D9D9E0"/>
+            </w:tcBorders>
+          </w:tcPr>
+          <w:p>
+            <w:pPr>
+              <w:spacing w:before="50" w:after="50"/>
+            </w:pPr>
+            <w:r>
+              <w:t xml:space="preserve">5</w:t>
+            </w:r>
+          </w:p>
+        </w:tc>
+        <w:tc>
+          <w:tcPr>
+            <w:tcW w:type="dxa" w:w="864"/>
+            <w:tcBorders>
+              <w:top w:val="single" w:sz="6" w:color="D9D9E0"/>
+              <w:left w:val="single" w:sz="6" w:color="D9D9E0"/>
+              <w:bottom w:val="single" w:sz="6" w:color="D9D9E0"/>
+              <w:right w:val="single" w:sz="6" w:color="D9D9E0"/>
+            </w:tcBorders>
+          </w:tcPr>
+          <w:p>
+            <w:pPr>
+              <w:spacing w:before="50" w:after="50"/>
+            </w:pPr>
+            <w:r>
+              <w:t xml:space="preserve">2.0</w:t>
+            </w:r>
+          </w:p>
+        </w:tc>
+        <w:tc>
+          <w:tcPr>
+            <w:tcW w:type="dxa" w:w="2304"/>
+            <w:tcBorders>
+              <w:top w:val="single" w:sz="6" w:color="D9D9E0"/>
+              <w:left w:val="single" w:sz="6" w:color="D9D9E0"/>
+              <w:bottom w:val="single" w:sz="6" w:color="D9D9E0"/>
+              <w:right w:val="single" w:sz="6" w:color="D9D9E0"/>
+            </w:tcBorders>
+          </w:tcPr>
+          <w:p>
+            <w:pPr>
+              <w:spacing w:before="50" w:after="50"/>
+            </w:pPr>
+            <w:r>
+              <w:t xml:space="preserve">docs/adr/D-17-urgency-prioritised-harness-queue.md; evaluation/harness.py prioritise; tests/test_harness_prioritise.py; evaluation/results dev_local_10_20260923, dev_local_80_20260923, gt_local_20260923. All $0.</w:t>
+            </w:r>
+          </w:p>
+        </w:tc>
+        <w:tc>
+          <w:tcPr>
+            <w:tcW w:type="dxa" w:w="1728"/>
+            <w:tcBorders>
+              <w:top w:val="single" w:sz="6" w:color="D9D9E0"/>
+              <w:left w:val="single" w:sz="6" w:color="D9D9E0"/>
+              <w:bottom w:val="single" w:sz="6" w:color="D9D9E0"/>
+              <w:right w:val="single" w:sz="6" w:color="D9D9E0"/>
+            </w:tcBorders>
+          </w:tcPr>
+          <w:p>
+            <w:pPr>
+              <w:spacing w:before="50" w:after="50"/>
+            </w:pPr>
+            <w:r>
+              <w:t xml:space="preserve">None.</w:t>
+            </w:r>
+          </w:p>
+        </w:tc>
+      </w:tr>
+      <w:tr>
+        <w:tc>
+          <w:tcPr>
+            <w:tcW w:type="dxa" w:w="1152"/>
+            <w:tcBorders>
+              <w:top w:val="single" w:sz="6" w:color="D9D9E0"/>
+              <w:left w:val="single" w:sz="6" w:color="D9D9E0"/>
+              <w:bottom w:val="single" w:sz="6" w:color="D9D9E0"/>
+              <w:right w:val="single" w:sz="6" w:color="D9D9E0"/>
+            </w:tcBorders>
+          </w:tcPr>
+          <w:p>
+            <w:pPr>
+              <w:spacing w:before="50" w:after="50"/>
+            </w:pPr>
+            <w:r>
+              <w:t xml:space="preserve">2026-09-24</w:t>
+            </w:r>
+          </w:p>
+        </w:tc>
+        <w:tc>
+          <w:tcPr>
+            <w:tcW w:type="dxa" w:w="2736"/>
+            <w:tcBorders>
+              <w:top w:val="single" w:sz="6" w:color="D9D9E0"/>
+              <w:left w:val="single" w:sz="6" w:color="D9D9E0"/>
+              <w:bottom w:val="single" w:sz="6" w:color="D9D9E0"/>
+              <w:right w:val="single" w:sz="6" w:color="D9D9E0"/>
+            </w:tcBorders>
+          </w:tcPr>
+          <w:p>
+            <w:pPr>
+              <w:spacing w:before="50" w:after="50"/>
+            </w:pPr>
+            <w:r>
+              <w:t xml:space="preserve">410-ticket development run on the local models completed: 304 auto-respond, 71 escalate, 35 block; 21 generator unknowns and 12 empty retrievals; 418 of 1,605 calls served from the cache.</w:t>
+            </w:r>
+          </w:p>
+        </w:tc>
+        <w:tc>
+          <w:tcPr>
+            <w:tcW w:type="dxa" w:w="864"/>
+            <w:tcBorders>
+              <w:top w:val="single" w:sz="6" w:color="D9D9E0"/>
+              <w:left w:val="single" w:sz="6" w:color="D9D9E0"/>
+              <w:bottom w:val="single" w:sz="6" w:color="D9D9E0"/>
+              <w:right w:val="single" w:sz="6" w:color="D9D9E0"/>
+            </w:tcBorders>
+          </w:tcPr>
+          <w:p>
+            <w:pPr>
+              <w:spacing w:before="50" w:after="50"/>
+            </w:pPr>
+            <w:r>
+              <w:t xml:space="preserve">5</w:t>
+            </w:r>
+          </w:p>
+        </w:tc>
+        <w:tc>
+          <w:tcPr>
+            <w:tcW w:type="dxa" w:w="864"/>
+            <w:tcBorders>
+              <w:top w:val="single" w:sz="6" w:color="D9D9E0"/>
+              <w:left w:val="single" w:sz="6" w:color="D9D9E0"/>
+              <w:bottom w:val="single" w:sz="6" w:color="D9D9E0"/>
+              <w:right w:val="single" w:sz="6" w:color="D9D9E0"/>
+            </w:tcBorders>
+          </w:tcPr>
+          <w:p>
+            <w:pPr>
+              <w:spacing w:before="50" w:after="50"/>
+            </w:pPr>
+            <w:r>
+              <w:t xml:space="preserve">2.0</w:t>
+            </w:r>
+          </w:p>
+        </w:tc>
+        <w:tc>
+          <w:tcPr>
+            <w:tcW w:type="dxa" w:w="2304"/>
+            <w:tcBorders>
+              <w:top w:val="single" w:sz="6" w:color="D9D9E0"/>
+              <w:left w:val="single" w:sz="6" w:color="D9D9E0"/>
+              <w:bottom w:val="single" w:sz="6" w:color="D9D9E0"/>
+              <w:right w:val="single" w:sz="6" w:color="D9D9E0"/>
+            </w:tcBorders>
+          </w:tcPr>
+          <w:p>
+            <w:pPr>
+              <w:spacing w:before="50" w:after="50"/>
+            </w:pPr>
+            <w:r>
+              <w:t xml:space="preserve">evaluation/results/dev_local_410_20260924/ with metrics report, results table and fairness report.</w:t>
+            </w:r>
+          </w:p>
+        </w:tc>
+        <w:tc>
+          <w:tcPr>
+            <w:tcW w:type="dxa" w:w="1728"/>
+            <w:tcBorders>
+              <w:top w:val="single" w:sz="6" w:color="D9D9E0"/>
+              <w:left w:val="single" w:sz="6" w:color="D9D9E0"/>
+              <w:bottom w:val="single" w:sz="6" w:color="D9D9E0"/>
+              <w:right w:val="single" w:sz="6" w:color="D9D9E0"/>
+            </w:tcBorders>
+          </w:tcPr>
+          <w:p>
+            <w:pPr>
+              <w:spacing w:before="50" w:after="50"/>
+            </w:pPr>
+            <w:r>
+              <w:t xml:space="preserve">None.</w:t>
+            </w:r>
+          </w:p>
+        </w:tc>
+      </w:tr>
+      <w:tr>
+        <w:tc>
+          <w:tcPr>
+            <w:tcW w:type="dxa" w:w="1152"/>
+            <w:tcBorders>
+              <w:top w:val="single" w:sz="6" w:color="D9D9E0"/>
+              <w:left w:val="single" w:sz="6" w:color="D9D9E0"/>
+              <w:bottom w:val="single" w:sz="6" w:color="D9D9E0"/>
+              <w:right w:val="single" w:sz="6" w:color="D9D9E0"/>
+            </w:tcBorders>
+          </w:tcPr>
+          <w:p>
+            <w:pPr>
+              <w:spacing w:before="50" w:after="50"/>
+            </w:pPr>
+            <w:r>
+              <w:t xml:space="preserve">2026-09-27</w:t>
+            </w:r>
+          </w:p>
+        </w:tc>
+        <w:tc>
+          <w:tcPr>
+            <w:tcW w:type="dxa" w:w="2736"/>
+            <w:tcBorders>
+              <w:top w:val="single" w:sz="6" w:color="D9D9E0"/>
+              <w:left w:val="single" w:sz="6" w:color="D9D9E0"/>
+              <w:bottom w:val="single" w:sz="6" w:color="D9D9E0"/>
+              <w:right w:val="single" w:sz="6" w:color="D9D9E0"/>
+            </w:tcBorders>
+          </w:tcPr>
+          <w:p>
+            <w:pPr>
+              <w:spacing w:before="50" w:after="50"/>
+            </w:pPr>
+            <w:r>
+              <w:t xml:space="preserve">Results table gains per-class precision and recall, the intent confusion matrix, a repeat-contacts row (baseline from history.repeat_contact) and an availability row. UTF-8 on every harness, results-table and prompt read and write, so a Windows (cp1252) run writes its results table. README: Python 3.11 required, PowerShell and Git Bash steps. Local 50 + 30 validation runs and a paid 80-ticket run.</w:t>
+            </w:r>
+          </w:p>
+        </w:tc>
+        <w:tc>
+          <w:tcPr>
+            <w:tcW w:type="dxa" w:w="864"/>
+            <w:tcBorders>
+              <w:top w:val="single" w:sz="6" w:color="D9D9E0"/>
+              <w:left w:val="single" w:sz="6" w:color="D9D9E0"/>
+              <w:bottom w:val="single" w:sz="6" w:color="D9D9E0"/>
+              <w:right w:val="single" w:sz="6" w:color="D9D9E0"/>
+            </w:tcBorders>
+          </w:tcPr>
+          <w:p>
+            <w:pPr>
+              <w:spacing w:before="50" w:after="50"/>
+            </w:pPr>
+            <w:r>
+              <w:t xml:space="preserve">5</w:t>
+            </w:r>
+          </w:p>
+        </w:tc>
+        <w:tc>
+          <w:tcPr>
+            <w:tcW w:type="dxa" w:w="864"/>
+            <w:tcBorders>
+              <w:top w:val="single" w:sz="6" w:color="D9D9E0"/>
+              <w:left w:val="single" w:sz="6" w:color="D9D9E0"/>
+              <w:bottom w:val="single" w:sz="6" w:color="D9D9E0"/>
+              <w:right w:val="single" w:sz="6" w:color="D9D9E0"/>
+            </w:tcBorders>
+          </w:tcPr>
+          <w:p>
+            <w:pPr>
+              <w:spacing w:before="50" w:after="50"/>
+            </w:pPr>
+            <w:r>
+              <w:t xml:space="preserve">3.0</w:t>
+            </w:r>
+          </w:p>
+        </w:tc>
+        <w:tc>
+          <w:tcPr>
+            <w:tcW w:type="dxa" w:w="2304"/>
+            <w:tcBorders>
+              <w:top w:val="single" w:sz="6" w:color="D9D9E0"/>
+              <w:left w:val="single" w:sz="6" w:color="D9D9E0"/>
+              <w:bottom w:val="single" w:sz="6" w:color="D9D9E0"/>
+              <w:right w:val="single" w:sz="6" w:color="D9D9E0"/>
+            </w:tcBorders>
+          </w:tcPr>
+          <w:p>
+            <w:pPr>
+              <w:spacing w:before="50" w:after="50"/>
+            </w:pPr>
+            <w:r>
+              <w:t xml:space="preserve">evaluation/harness.py; evaluation/results_table.py; regression tests reproducing the Windows default; README.md; evaluation/results local_80_20260927 (from local_50 + local_30, $0) and paid_80_20260927 ($0.90).</w:t>
+            </w:r>
+          </w:p>
+        </w:tc>
+        <w:tc>
+          <w:tcPr>
+            <w:tcW w:type="dxa" w:w="1728"/>
+            <w:tcBorders>
+              <w:top w:val="single" w:sz="6" w:color="D9D9E0"/>
+              <w:left w:val="single" w:sz="6" w:color="D9D9E0"/>
+              <w:bottom w:val="single" w:sz="6" w:color="D9D9E0"/>
+              <w:right w:val="single" w:sz="6" w:color="D9D9E0"/>
+            </w:tcBorders>
+          </w:tcPr>
+          <w:p>
+            <w:pPr>
+              <w:spacing w:before="50" w:after="50"/>
+            </w:pPr>
+            <w:r>
+              <w:t xml:space="preserve">None.</w:t>
+            </w:r>
+          </w:p>
+        </w:tc>
+      </w:tr>
+      <w:tr>
+        <w:tc>
+          <w:tcPr>
+            <w:tcW w:type="dxa" w:w="1152"/>
+            <w:tcBorders>
+              <w:top w:val="single" w:sz="6" w:color="D9D9E0"/>
+              <w:left w:val="single" w:sz="6" w:color="D9D9E0"/>
+              <w:bottom w:val="single" w:sz="6" w:color="D9D9E0"/>
+              <w:right w:val="single" w:sz="6" w:color="D9D9E0"/>
+            </w:tcBorders>
+          </w:tcPr>
+          <w:p>
+            <w:pPr>
+              <w:spacing w:before="50" w:after="50"/>
+            </w:pPr>
+            <w:r>
+              <w:t xml:space="preserve">2026-09-27</w:t>
+            </w:r>
+          </w:p>
+        </w:tc>
+        <w:tc>
+          <w:tcPr>
+            <w:tcW w:type="dxa" w:w="2736"/>
+            <w:tcBorders>
+              <w:top w:val="single" w:sz="6" w:color="D9D9E0"/>
+              <w:left w:val="single" w:sz="6" w:color="D9D9E0"/>
+              <w:bottom w:val="single" w:sz="6" w:color="D9D9E0"/>
+              <w:right w:val="single" w:sz="6" w:color="D9D9E0"/>
+            </w:tcBorders>
+          </w:tcPr>
+          <w:p>
+            <w:pPr>
+              <w:spacing w:before="50" w:after="50"/>
+            </w:pPr>
+            <w:r>
+              <w:t xml:space="preserve">The two final runs, started 15:45: the graded 80-ticket validation run and the free 50-ticket development run. Evaluation Framework results replaced with them and the report rebuilt. Results tables, Framework and report restamped with the code version that produced the runs.</w:t>
+            </w:r>
+          </w:p>
+        </w:tc>
+        <w:tc>
+          <w:tcPr>
+            <w:tcW w:type="dxa" w:w="864"/>
+            <w:tcBorders>
+              <w:top w:val="single" w:sz="6" w:color="D9D9E0"/>
+              <w:left w:val="single" w:sz="6" w:color="D9D9E0"/>
+              <w:bottom w:val="single" w:sz="6" w:color="D9D9E0"/>
+              <w:right w:val="single" w:sz="6" w:color="D9D9E0"/>
+            </w:tcBorders>
+          </w:tcPr>
+          <w:p>
+            <w:pPr>
+              <w:spacing w:before="50" w:after="50"/>
+            </w:pPr>
+            <w:r>
+              <w:t xml:space="preserve">5+7</w:t>
+            </w:r>
+          </w:p>
+        </w:tc>
+        <w:tc>
+          <w:tcPr>
+            <w:tcW w:type="dxa" w:w="864"/>
+            <w:tcBorders>
+              <w:top w:val="single" w:sz="6" w:color="D9D9E0"/>
+              <w:left w:val="single" w:sz="6" w:color="D9D9E0"/>
+              <w:bottom w:val="single" w:sz="6" w:color="D9D9E0"/>
+              <w:right w:val="single" w:sz="6" w:color="D9D9E0"/>
+            </w:tcBorders>
+          </w:tcPr>
+          <w:p>
+            <w:pPr>
+              <w:spacing w:before="50" w:after="50"/>
+            </w:pPr>
+            <w:r>
+              <w:t xml:space="preserve">2.0</w:t>
+            </w:r>
+          </w:p>
+        </w:tc>
+        <w:tc>
+          <w:tcPr>
+            <w:tcW w:type="dxa" w:w="2304"/>
+            <w:tcBorders>
+              <w:top w:val="single" w:sz="6" w:color="D9D9E0"/>
+              <w:left w:val="single" w:sz="6" w:color="D9D9E0"/>
+              <w:bottom w:val="single" w:sz="6" w:color="D9D9E0"/>
+              <w:right w:val="single" w:sz="6" w:color="D9D9E0"/>
+            </w:tcBorders>
+          </w:tcPr>
+          <w:p>
+            <w:pPr>
+              <w:spacing w:before="50" w:after="50"/>
+            </w:pPr>
+            <w:r>
+              <w:t xml:space="preserve">final_val_paid_80_20260927 (gpt-4o-mini + gpt-4o, cache off, $0.91, A8 reconciles); final_dev_local_50_20260927 ($0); docs/Evaluation_Framework.docx; AlokKulkarni_Capstone_Report.pdf; commits 47e0bc1 and f753269. 712 passed, 6 skipped; flake8 clean.</w:t>
+            </w:r>
+          </w:p>
+        </w:tc>
+        <w:tc>
+          <w:tcPr>
+            <w:tcW w:type="dxa" w:w="1728"/>
+            <w:tcBorders>
+              <w:top w:val="single" w:sz="6" w:color="D9D9E0"/>
+              <w:left w:val="single" w:sz="6" w:color="D9D9E0"/>
+              <w:bottom w:val="single" w:sz="6" w:color="D9D9E0"/>
+              <w:right w:val="single" w:sz="6" w:color="D9D9E0"/>
+            </w:tcBorders>
+          </w:tcPr>
+          <w:p>
+            <w:pPr>
+              <w:spacing w:before="50" w:after="50"/>
+            </w:pPr>
+            <w:r>
+              <w:t xml:space="preserve">None.</w:t>
+            </w:r>
+          </w:p>
+        </w:tc>
+      </w:tr>
+      <w:tr>
+        <w:tc>
+          <w:tcPr>
+            <w:tcW w:type="dxa" w:w="1152"/>
+            <w:tcBorders>
+              <w:top w:val="single" w:sz="6" w:color="D9D9E0"/>
+              <w:left w:val="single" w:sz="6" w:color="D9D9E0"/>
+              <w:bottom w:val="single" w:sz="6" w:color="D9D9E0"/>
+              <w:right w:val="single" w:sz="6" w:color="D9D9E0"/>
+            </w:tcBorders>
+          </w:tcPr>
+          <w:p>
+            <w:pPr>
+              <w:spacing w:before="50" w:after="50"/>
+            </w:pPr>
+            <w:r>
+              <w:t xml:space="preserve">2026-09-27</w:t>
+            </w:r>
+          </w:p>
+        </w:tc>
+        <w:tc>
+          <w:tcPr>
+            <w:tcW w:type="dxa" w:w="2736"/>
+            <w:tcBorders>
+              <w:top w:val="single" w:sz="6" w:color="D9D9E0"/>
+              <w:left w:val="single" w:sz="6" w:color="D9D9E0"/>
+              <w:bottom w:val="single" w:sz="6" w:color="D9D9E0"/>
+              <w:right w:val="single" w:sz="6" w:color="D9D9E0"/>
+            </w:tcBorders>
+          </w:tcPr>
+          <w:p>
+            <w:pPr>
+              <w:spacing w:before="50" w:after="50"/>
+            </w:pPr>
+            <w:r>
+              <w:t xml:space="preserve">Calibration builder and scoring sheet take any run as input, and calibration passages now come from the pipeline's retrieval query. A calibration set drawn from the local run was built, not scored, and removed. Demo runs. Presentation deck and diagrams final pass. Video recorded. Effort log week-four entries.</w:t>
+            </w:r>
+          </w:p>
+        </w:tc>
+        <w:tc>
+          <w:tcPr>
+            <w:tcW w:type="dxa" w:w="864"/>
+            <w:tcBorders>
+              <w:top w:val="single" w:sz="6" w:color="D9D9E0"/>
+              <w:left w:val="single" w:sz="6" w:color="D9D9E0"/>
+              <w:bottom w:val="single" w:sz="6" w:color="D9D9E0"/>
+              <w:right w:val="single" w:sz="6" w:color="D9D9E0"/>
+            </w:tcBorders>
+          </w:tcPr>
+          <w:p>
+            <w:pPr>
+              <w:spacing w:before="50" w:after="50"/>
+            </w:pPr>
+            <w:r>
+              <w:t xml:space="preserve">7</w:t>
+            </w:r>
+          </w:p>
+        </w:tc>
+        <w:tc>
+          <w:tcPr>
+            <w:tcW w:type="dxa" w:w="864"/>
+            <w:tcBorders>
+              <w:top w:val="single" w:sz="6" w:color="D9D9E0"/>
+              <w:left w:val="single" w:sz="6" w:color="D9D9E0"/>
+              <w:bottom w:val="single" w:sz="6" w:color="D9D9E0"/>
+              <w:right w:val="single" w:sz="6" w:color="D9D9E0"/>
+            </w:tcBorders>
+          </w:tcPr>
+          <w:p>
+            <w:pPr>
+              <w:spacing w:before="50" w:after="50"/>
+            </w:pPr>
+            <w:r>
+              <w:t xml:space="preserve">3.0</w:t>
+            </w:r>
+          </w:p>
+        </w:tc>
+        <w:tc>
+          <w:tcPr>
+            <w:tcW w:type="dxa" w:w="2304"/>
+            <w:tcBorders>
+              <w:top w:val="single" w:sz="6" w:color="D9D9E0"/>
+              <w:left w:val="single" w:sz="6" w:color="D9D9E0"/>
+              <w:bottom w:val="single" w:sz="6" w:color="D9D9E0"/>
+              <w:right w:val="single" w:sz="6" w:color="D9D9E0"/>
+            </w:tcBorders>
+          </w:tcPr>
+          <w:p>
+            <w:pPr>
+              <w:spacing w:before="50" w:after="50"/>
+            </w:pPr>
+            <w:r>
+              <w:t xml:space="preserve">Commit 82f8864 on origin/main; presentation/AlokKulkarni_Capstone_Presentation.pptx; submission video; workbooks/Effort_Log.docx week four.</w:t>
+            </w:r>
+          </w:p>
+        </w:tc>
+        <w:tc>
+          <w:tcPr>
+            <w:tcW w:type="dxa" w:w="1728"/>
+            <w:tcBorders>
+              <w:top w:val="single" w:sz="6" w:color="D9D9E0"/>
+              <w:left w:val="single" w:sz="6" w:color="D9D9E0"/>
+              <w:bottom w:val="single" w:sz="6" w:color="D9D9E0"/>
+              <w:right w:val="single" w:sz="6" w:color="D9D9E0"/>
+            </w:tcBorders>
+          </w:tcPr>
+          <w:p>
+            <w:pPr>
+              <w:spacing w:before="50" w:after="50"/>
+            </w:pPr>
+            <w:r>
+              <w:t xml:space="preserve">None.</w:t>
+            </w:r>
+          </w:p>
+        </w:tc>
+      </w:tr>
+    </w:tbl>
+    <w:p>
+      <w:pPr>
+        <w:spacing w:after="80"/>
+      </w:pPr>
+    </w:p>
+    <w:p>
+      <w:r>
+        <w:br w:type="page"/>
+      </w:r>
+    </w:p>
+    <w:p>
+      <w:pPr>
+        <w:spacing w:before="440" w:after="60"/>
+        <w:pBdr>
+          <w:bottom w:val="single" w:sz="8" w:space="6" w:color="E8660A"/>
+        </w:pBdr>
+      </w:pPr>
+      <w:r>
+        <w:rPr>
+          <w:b/>
+          <w:color w:val="E8660A"/>
+          <w:sz w:val="34"/>
+        </w:rPr>
+        <w:t xml:space="preserve">7   </w:t>
+      </w:r>
+      <w:r>
+        <w:rPr>
+          <w:b/>
+          <w:color w:val="1A1A2E"/>
+          <w:sz w:val="34"/>
+        </w:rPr>
         <w:t>Estimates against reality</w:t>
       </w:r>
     </w:p>
@@ -8945,7 +9727,7 @@
           <w:color w:val="E8660A"/>
           <w:sz w:val="34"/>
         </w:rPr>
-        <w:t xml:space="preserve">7   </w:t>
+        <w:t xml:space="preserve">8   </w:t>
       </w:r>
       <w:r>
         <w:rPr>
@@ -9286,7 +10068,7 @@
           <w:color w:val="E8660A"/>
           <w:sz w:val="34"/>
         </w:rPr>
-        <w:t xml:space="preserve">8   </w:t>
+        <w:t xml:space="preserve">9   </w:t>
       </w:r>
       <w:r>
         <w:rPr>
@@ -9481,7 +10263,7 @@
           </w:tcPr>
           <w:p>
             <w:r>
-              <w:t>2026-09-21</w:t>
+              <w:t xml:space="preserve">2026-09-27</w:t>
             </w:r>
           </w:p>
         </w:tc>
@@ -9497,7 +10279,7 @@
           </w:tcPr>
           <w:p>
             <w:r>
-              <w:t>~113.5 (34.5 recorded in week one; 79 estimated across weeks two and three from commit spans)</w:t>
+              <w:t xml:space="preserve">~125.5 (34.5 recorded in week one; 79 estimated across weeks two and three from commit spans; 12 given from recollection for week four)</w:t>
             </w:r>
           </w:p>
         </w:tc>

</xml_diff>